<commit_message>
docs: record publication and pull request status
</commit_message>
<xml_diff>
--- a/reports/report_pr1.docx
+++ b/reports/report_pr1.docx
@@ -244,7 +244,7 @@
     </w:p>
     <w:p>
       <w:r>
-        <w:t>Локальные коммиты выполнены. Публикация файлов остановлена автоматической проверкой разрешений из-за персональных данных в публичном репозитории. Push пока не выполнен; на GitHub нельзя подтвердить появление about_me.md. Для завершения нужны подтверждение публикации и добавление публичного SSH-ключа в аккаунт. Полный журнал фактических команд: reports/commands.txt.</w:t>
+        <w:t>Выполнен git push -u origin main с явного разрешения пользователя. Учебные файлы, включая about_me.md и goals.md, опубликованы на GitHub. Для завершения SSH-части нужно добавить публичный SSH-ключ в аккаунт и проверить подключение. Локальный журнал команд: reports/commands.txt; свидетельства публикации: reports/publication.txt.</w:t>
       </w:r>
     </w:p>
     <w:p>
@@ -308,7 +308,7 @@
     </w:p>
     <w:p>
       <w:r>
-        <w:t>Настроен Git, создан учебный репозиторий, освоены add и commit, подготовлены сведения о студенте и три измеримые цели. Удалённая часть и SSH остаются незавершёнными по причинам, указанным выше; это не отчёт о полностью сданной работе.</w:t>
+        <w:t>Настроен Git, создан учебный репозиторий, освоены add и commit, подготовлены сведения о студенте и три измеримые цели. Выполнен push в публичный репозиторий. SSH остаётся незавершённым по причинам, указанным выше; это не отчёт о полностью сданной работе.</w:t>
       </w:r>
     </w:p>
     <w:sectPr>

</xml_diff>

<commit_message>
docs: complete reports for DevOps practices 1-4 with evidence
</commit_message>
<xml_diff>
--- a/reports/report_pr1.docx
+++ b/reports/report_pr1.docx
@@ -4,35 +4,90 @@
   <w:body>
     <w:p>
       <w:pPr>
-        <w:pStyle w:val="Heading1"/>
+        <w:spacing w:before="1400"/>
+        <w:jc w:val="center"/>
       </w:pPr>
       <w:r>
+        <w:rPr>
+          <w:b/>
+          <w:sz w:val="28"/>
+        </w:rPr>
         <w:t>Практическая работа №1</w:t>
       </w:r>
     </w:p>
     <w:p>
+      <w:pPr>
+        <w:spacing w:before="400"/>
+        <w:jc w:val="center"/>
+      </w:pPr>
       <w:r>
-        <w:t>Дисциплина: «Инструменты девопс». ИПТИП, кафедра индустриального программирования.</w:t>
+        <w:rPr>
+          <w:b/>
+          <w:sz w:val="28"/>
+        </w:rPr>
+        <w:t>Тема: Введение в DevOps. Установка и первичная настройка Git и GitHub</w:t>
+      </w:r>
+    </w:p>
+    <w:p>
+      <w:pPr>
+        <w:spacing w:before="400"/>
+        <w:jc w:val="center"/>
+      </w:pPr>
+      <w:r>
+        <w:rPr>
+          <w:b/>
+          <w:sz w:val="28"/>
+        </w:rPr>
+        <w:t>Дисциплина: Инструменты DevOps</w:t>
+      </w:r>
+    </w:p>
+    <w:p>
+      <w:pPr>
+        <w:spacing w:before="400"/>
+        <w:jc w:val="center"/>
+      </w:pPr>
+      <w:r>
+        <w:rPr>
+          <w:b/>
+          <w:sz w:val="28"/>
+        </w:rPr>
+        <w:t>Выполнил: Алиев Никита Денисович, ЭФБО-01-24</w:t>
+      </w:r>
+    </w:p>
+    <w:p>
+      <w:pPr>
+        <w:spacing w:before="400"/>
+        <w:jc w:val="center"/>
+      </w:pPr>
+      <w:r>
+        <w:rPr>
+          <w:b/>
+          <w:sz w:val="28"/>
+        </w:rPr>
+        <w:t>Преподаватель: Гиматдинов Дамир Маратович</w:t>
+      </w:r>
+    </w:p>
+    <w:p>
+      <w:pPr>
+        <w:spacing w:before="400"/>
+        <w:jc w:val="center"/>
+      </w:pPr>
+      <w:r>
+        <w:rPr>
+          <w:b/>
+          <w:sz w:val="28"/>
+        </w:rPr>
+        <w:t>ИПТИП · Кафедра индустриального программирования · 2026/2027</w:t>
       </w:r>
     </w:p>
     <w:p>
       <w:r>
-        <w:t>Тема: Введение в DevOps. Установка и первичная настройка Git и GitHub.</w:t>
-      </w:r>
-    </w:p>
-    <w:p>
-      <w:r>
-        <w:t>Выполнил: Алиев Никита, группа ЭФБО-01-24.</w:t>
-      </w:r>
-    </w:p>
-    <w:p>
-      <w:r>
-        <w:t>Преподаватель: Гиматдинов Дамир Маратович. Семестр 5, 2026/2027. Дата: 24.09.2026.</w:t>
+        <w:br w:type="page"/>
       </w:r>
     </w:p>
     <w:p>
       <w:pPr>
-        <w:pStyle w:val="Heading2"/>
+        <w:pStyle w:val="Heading1"/>
       </w:pPr>
       <w:r>
         <w:t>1. Цель работы</w:t>
@@ -40,139 +95,7 @@
     </w:p>
     <w:p>
       <w:r>
-        <w:t>Изучить культуру DevOps, настроить Git и учётную запись, освоить индекс, коммиты и отправку изменений в удалённый репозиторий.</w:t>
-      </w:r>
-    </w:p>
-    <w:p>
-      <w:pPr>
-        <w:pStyle w:val="Heading2"/>
-      </w:pPr>
-      <w:r>
-        <w:t>2. Краткая теория</w:t>
-      </w:r>
-    </w:p>
-    <w:p>
-      <w:r>
-        <w:t>DevOps связывает разработку и эксплуатацию общей ответственностью за результат. Автоматические проверки и развёртывание сокращают ручную работу; мониторинг даёт обратную связь. В модели CALMS выделяют культуру, автоматизацию, бережливые процессы, измерения и обмен знаниями. Git сохраняет историю изменений локально; GitHub предоставляет удалённое хранение, обсуждение и проверку изменений.</w:t>
-      </w:r>
-    </w:p>
-    <w:p>
-      <w:pPr>
-        <w:pStyle w:val="Heading2"/>
-      </w:pPr>
-      <w:r>
-        <w:t>3. Установка и настройка</w:t>
-      </w:r>
-    </w:p>
-    <w:p>
-      <w:r>
-        <w:t>Проверена установленная версия Git: 2.51.0.windows.1. Использован существующий профиль Aliev Nikita, aliev.n.d@edu.mirea.ru. В учебном репозитории профиль задан явно. Глобальный core.editor настроен в code --wait. VS Code установлен; авторизация GitHub подтверждена для NikiVence.</w:t>
-      </w:r>
-    </w:p>
-    <w:p>
-      <w:r>
-        <w:rPr>
-          <w:rFonts w:ascii="Consolas" w:hAnsi="Consolas"/>
-          <w:sz w:val="18"/>
-        </w:rPr>
-        <w:t>git --version</w:t>
-      </w:r>
-    </w:p>
-    <w:p>
-      <w:r>
-        <w:rPr>
-          <w:rFonts w:ascii="Consolas" w:hAnsi="Consolas"/>
-          <w:sz w:val="18"/>
-        </w:rPr>
-        <w:t>git config --get user.name</w:t>
-      </w:r>
-    </w:p>
-    <w:p>
-      <w:r>
-        <w:rPr>
-          <w:rFonts w:ascii="Consolas" w:hAnsi="Consolas"/>
-          <w:sz w:val="18"/>
-        </w:rPr>
-        <w:t>git config --get user.email</w:t>
-      </w:r>
-    </w:p>
-    <w:p>
-      <w:r>
-        <w:rPr>
-          <w:rFonts w:ascii="Consolas" w:hAnsi="Consolas"/>
-          <w:sz w:val="18"/>
-        </w:rPr>
-        <w:t>git config --global core.editor "code --wait"</w:t>
-      </w:r>
-    </w:p>
-    <w:p>
-      <w:pPr>
-        <w:pStyle w:val="Heading2"/>
-      </w:pPr>
-      <w:r>
-        <w:t>4. SSH и создание репозитория</w:t>
-      </w:r>
-    </w:p>
-    <w:p>
-      <w:r>
-        <w:t>Создана отдельная пара ключей Ed25519 в профиле пользователя, вне проекта. Регистрация публичного ключа через GitHub API завершилась HTTP 404, поэтому успешное ssh -T не заявляется. Точные действия завершения приведены в remaining.md. Создан публичный репозиторий https://github.com/NikiVence/devops-course-2026 с начальным README, затем выполнен clone по HTTPS с существующей авторизацией. SSH-клонирование пока не выполнено.</w:t>
-      </w:r>
-    </w:p>
-    <w:p>
-      <w:pPr>
-        <w:pStyle w:val="Heading2"/>
-      </w:pPr>
-      <w:r>
-        <w:t>5. Индекс и коммиты</w:t>
-      </w:r>
-    </w:p>
-    <w:p>
-      <w:r>
-        <w:t>Файл about_me.md был виден как Untracked (??), затем добавлен в индекс и коммит.</w:t>
-      </w:r>
-    </w:p>
-    <w:p>
-      <w:r>
-        <w:rPr>
-          <w:rFonts w:ascii="Consolas" w:hAnsi="Consolas"/>
-          <w:sz w:val="18"/>
-        </w:rPr>
-        <w:t>git add about_me.md</w:t>
-      </w:r>
-    </w:p>
-    <w:p>
-      <w:r>
-        <w:rPr>
-          <w:rFonts w:ascii="Consolas" w:hAnsi="Consolas"/>
-          <w:sz w:val="18"/>
-        </w:rPr>
-        <w:t>git commit -m "Add about_me.md with student info"</w:t>
-      </w:r>
-    </w:p>
-    <w:p>
-      <w:r>
-        <w:rPr>
-          <w:rFonts w:ascii="Consolas" w:hAnsi="Consolas"/>
-          <w:sz w:val="18"/>
-        </w:rPr>
-        <w:t>5a89cf5 Add about_me.md with student info</w:t>
-      </w:r>
-    </w:p>
-    <w:p>
-      <w:r>
-        <w:rPr>
-          <w:rFonts w:ascii="Consolas" w:hAnsi="Consolas"/>
-          <w:sz w:val="18"/>
-        </w:rPr>
-        <w:t>fcc4b62 docs: add semester goals</w:t>
-      </w:r>
-    </w:p>
-    <w:p>
-      <w:pPr>
-        <w:pStyle w:val="Heading3"/>
-      </w:pPr>
-      <w:r>
-        <w:t>Содержимое about_me.md</w:t>
+        <w:t>Освоить основы культуры DevOps, настроить Git и выполнить цикл создания и публикации первого репозитория: изменение → индекс → коммит → push.</w:t>
       </w:r>
     </w:p>
     <w:p>
@@ -180,35 +103,63 @@
         <w:pStyle w:val="Heading1"/>
       </w:pPr>
       <w:r>
-        <w:t>Обо мне</w:t>
+        <w:t>2. Рабочее окружение</w:t>
       </w:r>
     </w:p>
     <w:p>
       <w:r>
-        <w:t>- ФИО: Алиев Никита</w:t>
-      </w:r>
-    </w:p>
-    <w:p>
-      <w:r>
-        <w:t>- Группа: ЭФБО-01-24</w:t>
-      </w:r>
-    </w:p>
-    <w:p>
-      <w:r>
-        <w:t>- GitHub: NikiVence</w:t>
-      </w:r>
-    </w:p>
-    <w:p>
-      <w:r>
-        <w:t>- Технологии, которые хочу освоить в этом курсе:   1. Docker — упаковка приложения и его зависимостей в контейнер.   2. CI/CD (GitHub Actions) — автоматические проверки и сборка.   3. Linux (Bash) — работа с файлами, процессами и автоматизация команд.</w:t>
+        <w:t>Проверена установка Git 2.51.0.windows.1 и профиль автора Aliev Nikita, aliev.n.d@edu.mirea.ru. Для редактирования используется VS Code. Git хранит версии локально, GitHub предоставляет удалённый репозиторий.</w:t>
       </w:r>
     </w:p>
     <w:p>
       <w:pPr>
-        <w:pStyle w:val="Heading3"/>
+        <w:keepNext/>
       </w:pPr>
       <w:r>
-        <w:t>Домашнее задание — goals.md</w:t>
+        <w:drawing>
+          <wp:inline xmlns:a="http://schemas.openxmlformats.org/drawingml/2006/main" xmlns:pic="http://schemas.openxmlformats.org/drawingml/2006/picture">
+            <wp:extent cx="5903999" cy="1642385"/>
+            <wp:docPr id="1" name="Picture 1"/>
+            <wp:cNvGraphicFramePr>
+              <a:graphicFrameLocks noChangeAspect="1"/>
+            </wp:cNvGraphicFramePr>
+            <a:graphic>
+              <a:graphicData uri="http://schemas.openxmlformats.org/drawingml/2006/picture">
+                <pic:pic>
+                  <pic:nvPicPr>
+                    <pic:cNvPr id="0" name="git_setup.png"/>
+                    <pic:cNvPicPr/>
+                  </pic:nvPicPr>
+                  <pic:blipFill>
+                    <a:blip r:embed="rId9"/>
+                    <a:stretch>
+                      <a:fillRect/>
+                    </a:stretch>
+                  </pic:blipFill>
+                  <pic:spPr>
+                    <a:xfrm>
+                      <a:off x="0" y="0"/>
+                      <a:ext cx="5903999" cy="1642385"/>
+                    </a:xfrm>
+                    <a:prstGeom prst="rect"/>
+                  </pic:spPr>
+                </pic:pic>
+              </a:graphicData>
+            </a:graphic>
+          </wp:inline>
+        </w:drawing>
+      </w:r>
+    </w:p>
+    <w:p>
+      <w:pPr>
+        <w:jc w:val="center"/>
+      </w:pPr>
+      <w:r>
+        <w:rPr>
+          <w:i/>
+          <w:sz w:val="18"/>
+        </w:rPr>
+        <w:t>Рисунок — Git и профиль автора</w:t>
       </w:r>
     </w:p>
     <w:p>
@@ -216,104 +167,272 @@
         <w:pStyle w:val="Heading1"/>
       </w:pPr>
       <w:r>
-        <w:t>Цели на семестр</w:t>
+        <w:t>3. Репозиторий и первые коммиты</w:t>
       </w:r>
     </w:p>
     <w:p>
       <w:r>
-        <w:t>1. До конца октября 2026 года освоить GitHub Flow: провести не менее трёх    изменений через feature-ветки и PR, разобрать конфликт слияния.</w:t>
+        <w:t>Репозиторий: https://github.com/NikiVence/devops-course-2026. По текущей опубликованной истории подтверждены первоначальный коммит, добавление about_me.md и goals.md. Личные файлы оставлены в редакции студента.</w:t>
+      </w:r>
+    </w:p>
+    <w:p>
+      <w:pPr>
+        <w:keepNext/>
+      </w:pPr>
+      <w:r>
+        <w:drawing>
+          <wp:inline xmlns:a="http://schemas.openxmlformats.org/drawingml/2006/main" xmlns:pic="http://schemas.openxmlformats.org/drawingml/2006/picture">
+            <wp:extent cx="5903999" cy="1486734"/>
+            <wp:docPr id="2" name="Picture 2"/>
+            <wp:cNvGraphicFramePr>
+              <a:graphicFrameLocks noChangeAspect="1"/>
+            </wp:cNvGraphicFramePr>
+            <a:graphic>
+              <a:graphicData uri="http://schemas.openxmlformats.org/drawingml/2006/picture">
+                <pic:pic>
+                  <pic:nvPicPr>
+                    <pic:cNvPr id="0" name="initial_history.png"/>
+                    <pic:cNvPicPr/>
+                  </pic:nvPicPr>
+                  <pic:blipFill>
+                    <a:blip r:embed="rId10"/>
+                    <a:stretch>
+                      <a:fillRect/>
+                    </a:stretch>
+                  </pic:blipFill>
+                  <pic:spPr>
+                    <a:xfrm>
+                      <a:off x="0" y="0"/>
+                      <a:ext cx="5903999" cy="1486734"/>
+                    </a:xfrm>
+                    <a:prstGeom prst="rect"/>
+                  </pic:spPr>
+                </pic:pic>
+              </a:graphicData>
+            </a:graphic>
+          </wp:inline>
+        </w:drawing>
+      </w:r>
+    </w:p>
+    <w:p>
+      <w:pPr>
+        <w:jc w:val="center"/>
+      </w:pPr>
+      <w:r>
+        <w:rPr>
+          <w:i/>
+          <w:sz w:val="18"/>
+        </w:rPr>
+        <w:t>Рисунок — История опубликованной ПР1</w:t>
+      </w:r>
+    </w:p>
+    <w:p>
+      <w:pPr>
+        <w:keepNext/>
+      </w:pPr>
+      <w:r>
+        <w:drawing>
+          <wp:inline xmlns:a="http://schemas.openxmlformats.org/drawingml/2006/main" xmlns:pic="http://schemas.openxmlformats.org/drawingml/2006/picture">
+            <wp:extent cx="5903999" cy="2731941"/>
+            <wp:docPr id="3" name="Picture 3"/>
+            <wp:cNvGraphicFramePr>
+              <a:graphicFrameLocks noChangeAspect="1"/>
+            </wp:cNvGraphicFramePr>
+            <a:graphic>
+              <a:graphicData uri="http://schemas.openxmlformats.org/drawingml/2006/picture">
+                <pic:pic>
+                  <pic:nvPicPr>
+                    <pic:cNvPr id="0" name="about_and_goals.png"/>
+                    <pic:cNvPicPr/>
+                  </pic:nvPicPr>
+                  <pic:blipFill>
+                    <a:blip r:embed="rId11"/>
+                    <a:stretch>
+                      <a:fillRect/>
+                    </a:stretch>
+                  </pic:blipFill>
+                  <pic:spPr>
+                    <a:xfrm>
+                      <a:off x="0" y="0"/>
+                      <a:ext cx="5903999" cy="2731941"/>
+                    </a:xfrm>
+                    <a:prstGeom prst="rect"/>
+                  </pic:spPr>
+                </pic:pic>
+              </a:graphicData>
+            </a:graphic>
+          </wp:inline>
+        </w:drawing>
+      </w:r>
+    </w:p>
+    <w:p>
+      <w:pPr>
+        <w:jc w:val="center"/>
+      </w:pPr>
+      <w:r>
+        <w:rPr>
+          <w:i/>
+          <w:sz w:val="18"/>
+        </w:rPr>
+        <w:t>Рисунок — Сведения о студенте и цели</w:t>
+      </w:r>
+    </w:p>
+    <w:p>
+      <w:r/>
+      <w:r>
+        <w:rPr>
+          <w:rFonts w:ascii="Consolas" w:hAnsi="Consolas"/>
+          <w:sz w:val="18"/>
+        </w:rPr>
+        <w:t>git add</w:t>
+      </w:r>
+      <w:r>
+        <w:t xml:space="preserve"> подготавливает выбранное содержимое файлов в индексе; </w:t>
+      </w:r>
+      <w:r>
+        <w:rPr>
+          <w:rFonts w:ascii="Consolas" w:hAnsi="Consolas"/>
+          <w:sz w:val="18"/>
+        </w:rPr>
+        <w:t>git commit</w:t>
+      </w:r>
+      <w:r>
+        <w:t xml:space="preserve"> создаёт локальную версию; </w:t>
+      </w:r>
+      <w:r>
+        <w:rPr>
+          <w:rFonts w:ascii="Consolas" w:hAnsi="Consolas"/>
+          <w:sz w:val="18"/>
+        </w:rPr>
+        <w:t>git push</w:t>
+      </w:r>
+      <w:r>
+        <w:t xml:space="preserve"> отправляет коммиты на сервер. </w:t>
+      </w:r>
+      <w:r>
+        <w:rPr>
+          <w:rFonts w:ascii="Consolas" w:hAnsi="Consolas"/>
+          <w:sz w:val="18"/>
+        </w:rPr>
+        <w:t>origin</w:t>
+      </w:r>
+      <w:r>
+        <w:t xml:space="preserve"> — имя удалённого репозитория, </w:t>
+      </w:r>
+      <w:r>
+        <w:rPr>
+          <w:rFonts w:ascii="Consolas" w:hAnsi="Consolas"/>
+          <w:sz w:val="18"/>
+        </w:rPr>
+        <w:t>main</w:t>
+      </w:r>
+      <w:r>
+        <w:t xml:space="preserve"> — имя ветки.</w:t>
+      </w:r>
+    </w:p>
+    <w:p>
+      <w:pPr>
+        <w:pStyle w:val="Heading1"/>
+      </w:pPr>
+      <w:r>
+        <w:t>4. SSH и фактический статус</w:t>
       </w:r>
     </w:p>
     <w:p>
       <w:r>
-        <w:t>2. До конца ноября собрать Docker-образ системы управления консультациями    и описать запуск на чистой машине одной командой.</w:t>
+        <w:t xml:space="preserve">Ранее создан отдельный ключ Ed25519 для учебной работы. Проверка 30.09.2026 не подтвердила вход: сервер вернул Permission denied (publickey). Публикация через HTTPS работает. Для буквального выполнения SSH-части необходимо добавить публичный ключ в аккаунт GitHub и повторить </w:t>
+      </w:r>
+      <w:r>
+        <w:rPr>
+          <w:rFonts w:ascii="Consolas" w:hAnsi="Consolas"/>
+          <w:sz w:val="18"/>
+        </w:rPr>
+        <w:t>ssh -T</w:t>
+      </w:r>
+      <w:r>
+        <w:t>. Приватный ключ не включается в репозиторий и отчёт.</w:t>
+      </w:r>
+    </w:p>
+    <w:p>
+      <w:pPr>
+        <w:keepNext/>
+      </w:pPr>
+      <w:r>
+        <w:drawing>
+          <wp:inline xmlns:a="http://schemas.openxmlformats.org/drawingml/2006/main" xmlns:pic="http://schemas.openxmlformats.org/drawingml/2006/picture">
+            <wp:extent cx="5903999" cy="1331083"/>
+            <wp:docPr id="4" name="Picture 4"/>
+            <wp:cNvGraphicFramePr>
+              <a:graphicFrameLocks noChangeAspect="1"/>
+            </wp:cNvGraphicFramePr>
+            <a:graphic>
+              <a:graphicData uri="http://schemas.openxmlformats.org/drawingml/2006/picture">
+                <pic:pic>
+                  <pic:nvPicPr>
+                    <pic:cNvPr id="0" name="ssh_check.png"/>
+                    <pic:cNvPicPr/>
+                  </pic:nvPicPr>
+                  <pic:blipFill>
+                    <a:blip r:embed="rId12"/>
+                    <a:stretch>
+                      <a:fillRect/>
+                    </a:stretch>
+                  </pic:blipFill>
+                  <pic:spPr>
+                    <a:xfrm>
+                      <a:off x="0" y="0"/>
+                      <a:ext cx="5903999" cy="1331083"/>
+                    </a:xfrm>
+                    <a:prstGeom prst="rect"/>
+                  </pic:spPr>
+                </pic:pic>
+              </a:graphicData>
+            </a:graphic>
+          </wp:inline>
+        </w:drawing>
+      </w:r>
+    </w:p>
+    <w:p>
+      <w:pPr>
+        <w:jc w:val="center"/>
+      </w:pPr>
+      <w:r>
+        <w:rPr>
+          <w:i/>
+          <w:sz w:val="18"/>
+        </w:rPr>
+        <w:t>Рисунок — Проверка SSH</w:t>
+      </w:r>
+    </w:p>
+    <w:p>
+      <w:pPr>
+        <w:pStyle w:val="Heading1"/>
+      </w:pPr>
+      <w:r>
+        <w:t>5. Контрольные вопросы</w:t>
       </w:r>
     </w:p>
     <w:p>
       <w:r>
-        <w:t>3. До конца семестра настроить GitHub Actions: запуск тестов и линтера при    каждом Pull Request, сборка образа после успешной проверки main.</w:t>
+        <w:t>- DevOps уменьшает разрыв между разработкой и эксплуатацией через общую   ответственность, автоматизацию и обратную связь. - CALMS: культура, автоматизация, бережливые процессы, измерения, обмен знаниями. - Публичный SSH-ключ хранится на сервере, приватный — у владельца;   пароль аккаунта не требуется передавать при каждой Git-операции. - В методичке приведены метрики DORA: частота развёртываний, время доставки   изменения, доля неудачных изменений и время восстановления.</w:t>
       </w:r>
     </w:p>
     <w:p>
       <w:pPr>
-        <w:pStyle w:val="Heading2"/>
+        <w:pStyle w:val="Heading1"/>
       </w:pPr>
       <w:r>
-        <w:t>6. Публикация и фактический статус</w:t>
+        <w:t>6. Вывод</w:t>
       </w:r>
     </w:p>
     <w:p>
       <w:r>
-        <w:t>Выполнен git push -u origin main с явного разрешения пользователя. Учебные файлы, включая about_me.md и goals.md, опубликованы на GitHub. Для завершения SSH-части нужно добавить публичный SSH-ключ в аккаунт и проверить подключение. Локальный журнал команд: reports/commands.txt; свидетельства публикации: reports/publication.txt.</w:t>
-      </w:r>
-    </w:p>
-    <w:p>
-      <w:pPr>
-        <w:pStyle w:val="Heading2"/>
-      </w:pPr>
-      <w:r>
-        <w:t>7. Контрольные вопросы</w:t>
-      </w:r>
-    </w:p>
-    <w:p>
-      <w:r>
-        <w:t>1. Задача DevOps. Уменьшить разрыв между разработкой и эксплуатацией:    общая ответственность, автоматизация, быстрая обратная связь и надёжные релизы.</w:t>
-      </w:r>
-    </w:p>
-    <w:p>
-      <w:r>
-        <w:t>2. CALMS. Culture — культура сотрудничества; Automation — автоматизация;    Lean — устранение потерь; Measurement — измерения; Sharing — обмен знаниями.</w:t>
-      </w:r>
-    </w:p>
-    <w:p>
-      <w:r>
-        <w:t>3. add и commit. git add переносит выбранное содержимое в индекс;    git commit создаёт из индекса снимок в локальной истории. Отправку выполняет push.</w:t>
-      </w:r>
-    </w:p>
-    <w:p>
-      <w:r>
-        <w:t>4. SSH. Сервер знает публичный ключ, а клиент доказывает владение приватным.    Приватный ключ не передаётся серверу; его нужно хранить в секрете.</w:t>
-      </w:r>
-    </w:p>
-    <w:p>
-      <w:r>
-        <w:t>5. origin и main. origin — имя удалённого репозитория; main — имя ветки,    которую отправляют командой git push origin main.</w:t>
-      </w:r>
-    </w:p>
-    <w:p>
-      <w:r>
-        <w:t>6. DORA в методичке. Deployment Frequency — частота развёртываний;    Lead Time for Changes — время от коммита до production. Также перечислены    Change Failure Rate и Time to Restore Service.</w:t>
-      </w:r>
-    </w:p>
-    <w:p>
-      <w:pPr>
-        <w:pStyle w:val="Heading2"/>
-      </w:pPr>
-      <w:r>
-        <w:t>8. Подготовка к следующему занятию</w:t>
-      </w:r>
-    </w:p>
-    <w:p>
-      <w:r>
-        <w:t>Работа только в main повышает риск попадания непроверенного изменения в стабильную версию. Feature-ветка изолирует работу, PR даёт место обсуждению, а проверки и одобрение позволяют оценить изменение перед merge.</w:t>
-      </w:r>
-    </w:p>
-    <w:p>
-      <w:pPr>
-        <w:pStyle w:val="Heading2"/>
-      </w:pPr>
-      <w:r>
-        <w:t>9. Вывод</w:t>
-      </w:r>
-    </w:p>
-    <w:p>
-      <w:r>
-        <w:t>Настроен Git, создан учебный репозиторий, освоены add и commit, подготовлены сведения о студенте и три измеримые цели. Выполнен push в публичный репозиторий. SSH остаётся незавершённым по причинам, указанным выше; это не отчёт о полностью сданной работе.</w:t>
+        <w:t>Создан учебный репозиторий, сохранены сведения о студенте и цели на семестр, освоены индекс, коммит и удалённая публикация. SSH-этап требует завершения; этот результат отделён от уже работающего HTTPS-доступа.</w:t>
       </w:r>
     </w:p>
     <w:sectPr>
-      <w:pgSz w:w="12240" w:h="15840"/>
-      <w:pgMar w:top="1134" w:right="850" w:bottom="1134" w:left="1417" w:header="720" w:footer="720" w:gutter="0"/>
+      <w:pgSz w:w="11906" w:h="16838"/>
+      <w:pgMar w:top="964" w:right="850" w:bottom="964" w:left="1134" w:header="720" w:footer="720" w:gutter="0"/>
       <w:cols w:space="720"/>
       <w:docGrid w:linePitch="360"/>
     </w:sectPr>
@@ -684,9 +803,12 @@
     <w:name w:val="Normal"/>
     <w:qFormat/>
     <w:rsid w:val="00FC693F"/>
+    <w:pPr>
+      <w:spacing w:after="100" w:line="252" w:lineRule="auto"/>
+    </w:pPr>
     <w:rPr>
       <w:rFonts w:ascii="Times New Roman" w:hAnsi="Times New Roman"/>
-      <w:sz w:val="24"/>
+      <w:sz w:val="22"/>
     </w:rPr>
   </w:style>
   <w:style w:type="paragraph" w:styleId="Header">
@@ -748,11 +870,11 @@
       <w:outlineLvl w:val="0"/>
     </w:pPr>
     <w:rPr>
-      <w:rFonts w:asciiTheme="majorHAnsi" w:eastAsiaTheme="majorEastAsia" w:hAnsiTheme="majorHAnsi" w:cstheme="majorBidi"/>
+      <w:rFonts w:asciiTheme="majorHAnsi" w:eastAsiaTheme="majorEastAsia" w:hAnsiTheme="majorHAnsi" w:cstheme="majorBidi" w:ascii="Times New Roman" w:hAnsi="Times New Roman"/>
       <w:b/>
       <w:bCs/>
-      <w:color w:val="365F91" w:themeColor="accent1" w:themeShade="BF"/>
-      <w:sz w:val="28"/>
+      <w:color w:val="000000"/>
+      <w:sz w:val="26"/>
       <w:szCs w:val="28"/>
     </w:rPr>
   </w:style>
@@ -772,10 +894,10 @@
       <w:outlineLvl w:val="1"/>
     </w:pPr>
     <w:rPr>
-      <w:rFonts w:asciiTheme="majorHAnsi" w:eastAsiaTheme="majorEastAsia" w:hAnsiTheme="majorHAnsi" w:cstheme="majorBidi"/>
+      <w:rFonts w:asciiTheme="majorHAnsi" w:eastAsiaTheme="majorEastAsia" w:hAnsiTheme="majorHAnsi" w:cstheme="majorBidi" w:ascii="Times New Roman" w:hAnsi="Times New Roman"/>
       <w:b/>
       <w:bCs/>
-      <w:color w:val="4F81BD" w:themeColor="accent1"/>
+      <w:color w:val="000000"/>
       <w:sz w:val="26"/>
       <w:szCs w:val="26"/>
     </w:rPr>

</xml_diff>